<commit_message>
fix(thesis): align Chapter 5 conclusion and metrics with Chapter 4 results
</commit_message>
<xml_diff>
--- a/Project/Chapter_05.docx
+++ b/Project/Chapter_05.docx
@@ -119,7 +119,7 @@
           <w:i w:val="0"/>
           <w:sz w:val="32"/>
         </w:rPr>
-        <w:t>1) สามารถเข้าถึงแถบเมนูลัด (Rich Menu) บริเวณด้านล่างของห้องแชท ซึ่งแบ่งออกเป็น 4 เมนูหลัก ได้แก่</w:t>
+        <w:t>1) สามารถเข้าถึงแถบเมนูลัด (Rich Menu) บริเวณด้านล่างของห้องแชท ซึ่งแบ่งออกเป็น 3 ช่องฟังก์ชันหลัก ได้แก่</w:t>
       </w:r>
     </w:p>
     <w:p>
@@ -135,7 +135,7 @@
           <w:i w:val="0"/>
           <w:sz w:val="32"/>
         </w:rPr>
-        <w:t xml:space="preserve">   1.1) เมนู "ถ่ายรูป/ส่งรูปเพื่อวินิจฉัยโรค" สำหรับเปิดกล้องถ่ายภาพหรือเลือกภาพจากคลังภาพบนโทรศัพท์มือถือ</w:t>
+        <w:t xml:space="preserve">   1.1) เมนู "ถ่ายภาพตรวจโรคข้าว" สำหรับเปิดกล้องถ่ายภาพบนโทรศัพท์มือถือ เพื่อถ่ายภาพใบข้าวจากแปลงนาส่งตรวจได้ทันที</w:t>
       </w:r>
     </w:p>
     <w:p>
@@ -151,7 +151,7 @@
           <w:i w:val="0"/>
           <w:sz w:val="32"/>
         </w:rPr>
-        <w:t xml:space="preserve">   1.2) เมนู "วิธีถ่ายภาพที่ถูกต้อง" สำหรับเปิดดูคำแนะนำในการถ่ายภาพใบข้าวระยะใกล้ให้คมชัด</w:t>
+        <w:t xml:space="preserve">   1.2) เมนู "ส่งภาพตรวจโรคข้าว" สำหรับเปิดเลือกรูปภาพใบข้าวที่ถ่ายเก็บไว้ในคลังภาพโทรศัพท์ส่งเข้ามาตรวจ</w:t>
       </w:r>
     </w:p>
     <w:p>
@@ -167,7 +167,55 @@
           <w:i w:val="0"/>
           <w:sz w:val="32"/>
         </w:rPr>
-        <w:t xml:space="preserve">   1.3) เมนู "คู่มือโรคข้าว 5 ชนิด" สำหรับศึกษาข้อมูล ลักษณะอาการ และเชื้อสาเหตุของโรคข้าวเบื้องต้น</w:t>
+        <w:t xml:space="preserve">   1.3) เมนู "วิธีการใช้งานแชทบอท" สำหรับเปิดดูคำแนะนำขั้นตอนการใช้งานระบบ 3 ขั้นตอน และเทคนิคการถ่ายภาพใบข้าวระยะใกล้ให้คมชัด</w:t>
+      </w:r>
+    </w:p>
+    <w:p>
+      <w:pPr>
+        <w:pStyle w:val="BodyText3"/>
+        <w:spacing w:before="0" w:after="80"/>
+        <w:ind w:firstLine="850"/>
+      </w:pPr>
+      <w:r>
+        <w:rPr>
+          <w:rFonts w:ascii="TH Sarabun New" w:hAnsi="TH Sarabun New" w:cs="TH Sarabun New"/>
+          <w:b w:val="0"/>
+          <w:i w:val="0"/>
+          <w:sz w:val="32"/>
+        </w:rPr>
+        <w:t>2) สามารถส่งภาพถ่ายใบข้าวที่มีอาการผิดปกติเข้ามาในห้องแชทเพื่อตรวจวินิจฉัยโรคได้ทันที</w:t>
+      </w:r>
+    </w:p>
+    <w:p>
+      <w:pPr>
+        <w:pStyle w:val="BodyText3"/>
+        <w:spacing w:before="0" w:after="80"/>
+        <w:ind w:firstLine="850"/>
+      </w:pPr>
+      <w:r>
+        <w:rPr>
+          <w:rFonts w:ascii="TH Sarabun New" w:hAnsi="TH Sarabun New" w:cs="TH Sarabun New"/>
+          <w:b w:val="0"/>
+          <w:i w:val="0"/>
+          <w:sz w:val="32"/>
+        </w:rPr>
+        <w:t>3) สามารถรับภาพผลการวินิจฉัยที่แสดงกรอบสี่เหลี่ยม (Bounding Box) แยกสีตามชนิดรอยโรค ล้อมรอบรอยโรค พร้อมชื่อโรคภาษาอังกฤษและค่าความมั่นใจของโมเดล (Confidence Score เช่น bacterial_leaf_blight 0.86)</w:t>
+      </w:r>
+    </w:p>
+    <w:p>
+      <w:pPr>
+        <w:pStyle w:val="BodyText3"/>
+        <w:spacing w:before="0" w:after="80"/>
+        <w:ind w:firstLine="850"/>
+      </w:pPr>
+      <w:r>
+        <w:rPr>
+          <w:rFonts w:ascii="TH Sarabun New" w:hAnsi="TH Sarabun New" w:cs="TH Sarabun New"/>
+          <w:b w:val="0"/>
+          <w:i w:val="0"/>
+          <w:sz w:val="32"/>
+        </w:rPr>
+        <w:t>4) สามารถรับข้อความการ์ดสรุปผล (LINE Flex Message) ที่แสดงข้อมูลผลการตรวจและคำแนะนำการดูแลรักษาอย่างครบถ้วน ซึ่งประกอบด้วย:</w:t>
       </w:r>
     </w:p>
     <w:p>
@@ -183,55 +231,7 @@
           <w:i w:val="0"/>
           <w:sz w:val="32"/>
         </w:rPr>
-        <w:t xml:space="preserve">   1.4) เมนู "สอบถามผู้เชี่ยวชาญ/ติดต่อเรา" สำหรับดูข้อมูลช่องทางการติดต่อเจ้าหน้าที่และผู้พัฒนาระบบ</w:t>
-      </w:r>
-    </w:p>
-    <w:p>
-      <w:pPr>
-        <w:pStyle w:val="BodyText3"/>
-        <w:spacing w:before="0" w:after="80"/>
-        <w:ind w:firstLine="850"/>
-      </w:pPr>
-      <w:r>
-        <w:rPr>
-          <w:rFonts w:ascii="TH Sarabun New" w:hAnsi="TH Sarabun New" w:cs="TH Sarabun New"/>
-          <w:b w:val="0"/>
-          <w:i w:val="0"/>
-          <w:sz w:val="32"/>
-        </w:rPr>
-        <w:t>2) สามารถส่งภาพถ่ายใบข้าวที่มีอาการผิดปกติเข้ามาในห้องแชทเพื่อตรวจวินิจฉัยโรคได้ทันที</w:t>
-      </w:r>
-    </w:p>
-    <w:p>
-      <w:pPr>
-        <w:pStyle w:val="BodyText3"/>
-        <w:spacing w:before="0" w:after="80"/>
-        <w:ind w:firstLine="850"/>
-      </w:pPr>
-      <w:r>
-        <w:rPr>
-          <w:rFonts w:ascii="TH Sarabun New" w:hAnsi="TH Sarabun New" w:cs="TH Sarabun New"/>
-          <w:b w:val="0"/>
-          <w:i w:val="0"/>
-          <w:sz w:val="32"/>
-        </w:rPr>
-        <w:t>3) สามารถรับภาพผลการวินิจฉัยที่แสดงกรอบสี่เหลี่ยมสีแดง (Bounding Box) ล้อมรอบรอยโรค พร้อมชื่อโรคและค่าความมั่นใจของโมเดล (Confidence Score ในรูปแบบเปอร์เซ็นต์)</w:t>
-      </w:r>
-    </w:p>
-    <w:p>
-      <w:pPr>
-        <w:pStyle w:val="BodyText3"/>
-        <w:spacing w:before="0" w:after="80"/>
-        <w:ind w:firstLine="850"/>
-      </w:pPr>
-      <w:r>
-        <w:rPr>
-          <w:rFonts w:ascii="TH Sarabun New" w:hAnsi="TH Sarabun New" w:cs="TH Sarabun New"/>
-          <w:b w:val="0"/>
-          <w:i w:val="0"/>
-          <w:sz w:val="32"/>
-        </w:rPr>
-        <w:t>4) สามารถรับข้อความการ์ดสรุปผล (LINE Flex Message) ที่แสดงข้อมูลผลการตรวจและคำแนะนำการดูแลรักษาอย่างครบถ้วน ซึ่งประกอบด้วย:</w:t>
+        <w:t xml:space="preserve">   4.1) ชื่อโรคที่ตรวจพบ ทั้งภาษาไทยและภาษาอังกฤษ</w:t>
       </w:r>
     </w:p>
     <w:p>
@@ -247,7 +247,7 @@
           <w:i w:val="0"/>
           <w:sz w:val="32"/>
         </w:rPr>
-        <w:t xml:space="preserve">   4.1) ชื่อโรคที่ตรวจพบ ทั้งภาษาไทยและภาษาอังกฤษ</w:t>
+        <w:t xml:space="preserve">   4.2) สาเหตุของโรค (เชื้อราหรือเชื้อแบคทีเรีย)</w:t>
       </w:r>
     </w:p>
     <w:p>
@@ -263,7 +263,7 @@
           <w:i w:val="0"/>
           <w:sz w:val="32"/>
         </w:rPr>
-        <w:t xml:space="preserve">   4.2) สาเหตุของโรค (เชื้อราหรือเชื้อแบคทีเรีย)</w:t>
+        <w:t xml:space="preserve">   4.3) ลักษณะอาการของรอยโรค</w:t>
       </w:r>
     </w:p>
     <w:p>
@@ -279,7 +279,7 @@
           <w:i w:val="0"/>
           <w:sz w:val="32"/>
         </w:rPr>
-        <w:t xml:space="preserve">   4.3) ลักษณะอาการของรอยโรค</w:t>
+        <w:t xml:space="preserve">   4.4) สารเคมีหรือสารชีวภัณฑ์ที่แนะนำในการควบคุมโรค พร้อมอัตราการผสมต่อน้ำ 20 ลิตร ตามคู่มือของกรมการข้าว</w:t>
       </w:r>
     </w:p>
     <w:p>
@@ -295,22 +295,6 @@
           <w:i w:val="0"/>
           <w:sz w:val="32"/>
         </w:rPr>
-        <w:t xml:space="preserve">   4.4) สารเคมีหรือสารชีวภัณฑ์ที่แนะนำในการควบคุมโรค พร้อมอัตราการผสมต่อน้ำ 20 ลิตร ตามคู่มือของกรมการข้าว</w:t>
-      </w:r>
-    </w:p>
-    <w:p>
-      <w:pPr>
-        <w:pStyle w:val="BodyText3"/>
-        <w:spacing w:before="0" w:after="80"/>
-        <w:ind w:firstLine="1134"/>
-      </w:pPr>
-      <w:r>
-        <w:rPr>
-          <w:rFonts w:ascii="TH Sarabun New" w:hAnsi="TH Sarabun New" w:cs="TH Sarabun New"/>
-          <w:b w:val="0"/>
-          <w:i w:val="0"/>
-          <w:sz w:val="32"/>
-        </w:rPr>
         <w:t xml:space="preserve">   4.5) แนวทางการจัดการแปลงนา เช่น การระบายน้ำ การลดปุ๋ยไนโตรเจน และการกำจัดวัชพืช</w:t>
       </w:r>
     </w:p>
@@ -343,7 +327,7 @@
           <w:i w:val="0"/>
           <w:sz w:val="32"/>
         </w:rPr>
-        <w:t>6) สามารถรับข้อความแจ้งเตือนให้ถ่ายภาพใหม่ ในกรณีที่ภาพถ่ายมืดเกินไป มีแสงสะท้อนจ้า ภาพเบลอ หรือ AI มีค่าความมั่นใจต่ำกว่า 30% เพื่อช่วยให้เกษตรกรได้ผลวิเคราะห์ที่แม่นยำขึ้น</w:t>
+        <w:t>6) สามารถรับข้อความแจ้งเตือนให้ถ่ายภาพใหม่ ในกรณีที่ภาพถ่ายหลุดโฟกัส ภาพเบลอ หรือมืดเกินไป เพื่อช่วยให้เกษตรกรได้ผลวิเคราะห์ที่แม่นยำขึ้น</w:t>
       </w:r>
     </w:p>
     <w:p>
@@ -523,23 +507,23 @@
           <w:i w:val="0"/>
           <w:sz w:val="32"/>
         </w:rPr>
-        <w:t>• โมเดล RT-DETR-L v5 ซึ่งฝึกฝนบนชุดข้อมูลภาพถ่ายใบข้าว 3,829 ภาพ ทำคะแนนเฉลี่ยบนชุดข้อมูลทดสอบ (Test Set) วัดค่า mAP@0.5 ได้สูงถึง 70.6% (0.7056) โดยมีความแม่นยำรวม (Precision) 73.5% และตรวจจับได้ครอบคลุม (Recall) 70.2%</w:t>
-      </w:r>
-    </w:p>
-    <w:p>
-      <w:pPr>
-        <w:pStyle w:val="BodyText3"/>
-        <w:spacing w:before="0" w:after="80"/>
-        <w:ind w:firstLine="850"/>
-      </w:pPr>
-      <w:r>
-        <w:rPr>
-          <w:rFonts w:ascii="TH Sarabun New" w:hAnsi="TH Sarabun New" w:cs="TH Sarabun New"/>
-          <w:b w:val="0"/>
-          <w:i w:val="0"/>
-          <w:sz w:val="32"/>
-        </w:rPr>
-        <w:t>• ประสิทธิภาพแยกตามรายชนิดโรค: โรคใบไหม้ (Leaf Blast) ได้ 77.6% (v3 ได้ 86.8%), โรคใบจุดสีน้ำตาล (Brown Spot) ได้ 79.9%, โรคใบขอบกาบแห้ง (Leaf Scald) ได้ 54.5% (v4 ได้ 55.0%), โรคกาบใบแห้ง (Sheath Blight) ได้ 71.3% และโรคขอบใบแห้ง (BLB) ทำคะแนนได้ถึง 69.5%</w:t>
+        <w:t>• โมเดล RT-DETR-L v5 ซึ่งฝึกฝนบนชุดข้อมูลภาพถ่ายใบข้าว 3,829 ภาพ ทำคะแนนเฉลี่ยบนชุดข้อมูลทดสอบ (Test Set) วัดค่า mAP@0.5 ได้สูงถึง 70.6% (0.7056) และค่า mAP@0.5:0.95 อยู่ที่ 35.5% (0.3554) โดยมีความแม่นยำรวม (Precision) 73.5% และตรวจจับได้ครอบคลุม (Recall) 70.2%</w:t>
+      </w:r>
+    </w:p>
+    <w:p>
+      <w:pPr>
+        <w:pStyle w:val="BodyText3"/>
+        <w:spacing w:before="0" w:after="80"/>
+        <w:ind w:firstLine="850"/>
+      </w:pPr>
+      <w:r>
+        <w:rPr>
+          <w:rFonts w:ascii="TH Sarabun New" w:hAnsi="TH Sarabun New" w:cs="TH Sarabun New"/>
+          <w:b w:val="0"/>
+          <w:i w:val="0"/>
+          <w:sz w:val="32"/>
+        </w:rPr>
+        <w:t>• ประสิทธิภาพแยกตามรายชนิดโรคบนชุดข้อมูลทดสอบ: โรคใบจุดสีน้ำตาล (Brown Spot) ได้คะแนน mAP@0.5 สูงสุดที่ 79.9% (Precision 78.4%, Recall 73.0%), โรคใบไหม้ (Leaf Blast) ได้ 77.6% (Precision 84.2%, Recall 72.1%), โรคกาบใบแห้ง (Sheath Blight) ได้ 71.3% (Precision 70.7%, Recall 73.8%), โรคขอบใบแห้ง (BLB) ทำคะแนนได้ถึง 69.5% (Precision 78.7%, Recall 75.3%) และโรคใบขอบกาบแห้ง (Leaf Scald) ได้ 54.5% (Precision 55.6%, Recall 56.5%)</w:t>
       </w:r>
     </w:p>
     <w:p>
@@ -683,7 +667,7 @@
           <w:i w:val="0"/>
           <w:sz w:val="32"/>
         </w:rPr>
-        <w:t>• ผลการประเมินด้วยเกณฑ์ RAGAS บนชุดคำถามทดสอบ 70 ข้อ พบว่า: Context Recall อยู่ที่ 28.59%, Context Precision สูงถึง 51.05%, และ Faithfulness อยู่ในเกณฑ์สูงถึง 76.50% ช่วยให้มั่นใจได้ว่าคำแนะนำถูกต้องตามคู่มือของกรมการข้าว และไม่มีการสร้างข้อมูลที่ผิดพลาด (Hallucination) ในเรื่องชื่อสารเคมีและอัตราผสม</w:t>
+        <w:t>• ผลการประเมินด้วยเกณฑ์ RAGAS บนชุดคำถามทดสอบ 70 ข้อ พบว่า: Context Recall อยู่ที่ 28.59%, Context Precision สูงถึง 51.05%, Faithfulness อยู่ในเกณฑ์สูงถึง 76.50% ช่วยให้มั่นใจได้ว่าคำแนะนำถูกต้องตามคู่มือของกรมการข้าว และไม่มีการสร้างข้อมูลที่ผิดพลาด (Hallucination) ในเรื่องชื่อสารเคมีและอัตราผสม และ Answer Relevancy อยู่ที่ 56.85% ตอบคำถามได้ตรงประเด็นความต้องการของเกษตรกร</w:t>
       </w:r>
     </w:p>
     <w:p>
@@ -747,7 +731,7 @@
           <w:i w:val="0"/>
           <w:sz w:val="32"/>
         </w:rPr>
-        <w:t>• เวลาการตอบสนองรวมของระบบตั้งแต่ผู้ใช้ส่งภาพจนได้รับคำตอบ (End-to-End Latency) เฉลี่ยเพียง 1.68 วินาที จัดว่ามีความรวดเร็วและตอบสนองได้ดีสำหรับการใช้งานบนโทรศัพท์มือถือ</w:t>
+        <w:t>• เวลาการตอบสนองรวมของระบบตั้งแต่ผู้ใช้ส่งภาพจนได้รับคำตอบ (End-to-End Latency) เฉลี่ยเพียง 1.68 วินาที (ประกอบด้วยเวลาส่งผ่านเครือข่าย LINE Webhook 120.5 ms, n8n Routing 45.0 ms, RT-DETR-L v5 Vision Inference 6.8 ms, Hybrid Search 45.2 ms, LLM Answer Synthesis 1,120.0 ms และ Flex Message Assembly &amp; Dispatch 342.5 ms) จัดว่ามีความรวดเร็วและตอบสนองได้ดีสำหรับการใช้งานบนโทรศัพท์มือถือ</w:t>
       </w:r>
     </w:p>
     <w:p>
@@ -1462,7 +1446,7 @@
           <w:i w:val="0"/>
           <w:sz w:val="32"/>
         </w:rPr>
-        <w:t>เขียนฟังก์ชัน find_prominent_vegetation_bbox() โดยแปลงภาพเป็นระบบสี HSV เพื่อตรวจจับกลุ่มพืชสีเขียวที่มีขนาดใหญ่ที่สุดในภาพ แล้วสร้าง Bounding Box เสมือนส่งให้ SAM อัตโนมัติ ช่วยให้ตัดพื้นหลังภาพ Healthy สำเร็จได้ถึง 88.1%</w:t>
+        <w:t>เขียนฟังก์ชัน find_prominent_vegetation_bbox() โดยแปลงภาพเป็นระบบสี HSV เพื่อตรวจจับกลุ่มพืชสีเขียวที่มีขนาดใหญ่ที่สุดในภาพ แล้วสร้าง Bounding Box เสมือนส่งให้ SAM อัตโนมัติ ช่วยให้ระบบสามารถประมวลผลตัดพื้นหลังภาพใบข้าวสมบูรณ์ได้อย่างถูกต้องโดยไม่เกิดข้อผิดพลาด</w:t>
       </w:r>
     </w:p>
     <w:p>

</xml_diff>

<commit_message>
docs(thesis): enrich Chapter 5 conclusion with comprehensive experimental metrics from Chapter 4
</commit_message>
<xml_diff>
--- a/Project/Chapter_05.docx
+++ b/Project/Chapter_05.docx
@@ -507,7 +507,7 @@
           <w:i w:val="0"/>
           <w:sz w:val="32"/>
         </w:rPr>
-        <w:t>• โมเดล RT-DETR-L v5 ซึ่งฝึกฝนบนชุดข้อมูลภาพถ่ายใบข้าว 3,829 ภาพ ทำคะแนนเฉลี่ยบนชุดข้อมูลทดสอบ (Test Set) วัดค่า mAP@0.5 ได้สูงถึง 70.6% (0.7056) และค่า mAP@0.5:0.95 อยู่ที่ 35.5% (0.3554) โดยมีความแม่นยำรวม (Precision) 73.5% และตรวจจับได้ครอบคลุม (Recall) 70.2%</w:t>
+        <w:t>• โมเดล RT-DETR-L v5 ซึ่งฝึกฝนบนชุดข้อมูลภาพถ่ายใบข้าว 3,829 ภาพ ทำคะแนนเฉลี่ยบนชุดข้อมูลทดสอบมาตรฐาน (Test Set จำนวน 354 ภาพ รวมรอยโรค 576 กรอบ) วัดค่า mAP@0.5 ได้สูงถึง 70.6% (0.7056) และค่า mAP@0.5:0.95 อยู่ที่ 35.5% (0.3554) โดยมีความแม่นยำรวม (Precision) 73.5% และตรวจจับได้ครอบคลุม (Recall) 70.2% ซึ่งพัฒนาขึ้นอย่างก้าวกระโดดเมื่อเทียบกับโมเดลรุ่นตั้งต้น (Baseline v1) ที่ทำคะแนน mAP@0.5 ได้ 59.3% (เพิ่มขึ้นถึง +11.3%) และมีความแม่นยำรวมเพิ่มขึ้นจาก 56.5% เป็น 73.5% (เพิ่มขึ้นถึง +17.0%)</w:t>
       </w:r>
     </w:p>
     <w:p>
@@ -539,7 +539,7 @@
           <w:i w:val="0"/>
           <w:sz w:val="32"/>
         </w:rPr>
-        <w:t>• ประสบความสำเร็จในการแก้ปัญหาค่าความแม่นยำต่ำของโรคขอบใบแห้ง (BLB) ซึ่งในเวอร์ชัน 4 เคยได้เพียง 7.42% ให้เพิ่มขึ้นเป็น 69.50% (เพิ่มขึ้นถึง 62.1%) ด้วยวิธี Data-Centric AI โดยปรับปรุงฉลากข้อมูลแบบ Continuous Morphological Bounding Box จากเดิมที่ตีกรอบย่อยซ้ำซ้อน 5,922 กล่อง รวบเหลือ 1,863 กล่องที่ตรงตามลักษณะแผลจริง</w:t>
+        <w:t>• ประสบความสำเร็จในการแก้ปัญหาค่าความแม่นยำต่ำของโรคขอบใบแห้ง (BLB) ซึ่งในเวอร์ชัน 4 เคยได้เพียง 7.42% ให้เพิ่มขึ้นเป็น 69.50% (เพิ่มขึ้นถึง 62.1%) ด้วยวิธี Data-Centric AI โดยปรับปรุงฉลากข้อมูลแบบ Continuous Morphological Bounding Box จากเดิมที่ตีกรอบย่อยซ้ำซ้อน 5,922 กล่อง รวบเหลือ 1,863 กล่องที่ตรงตามลักษณะแผลจริง (ลดความซ้ำซ้อนของกรอบลงได้ 68.5%)</w:t>
       </w:r>
     </w:p>
     <w:p>
@@ -587,7 +587,7 @@
           <w:i w:val="0"/>
           <w:sz w:val="32"/>
         </w:rPr>
-        <w:t>• ช่วยแก้ปัญหาของโมเดลตัดฉากหลังเดิมที่ทำให้ภาพกลายเป็นจอดำสูงถึง 43.8% ด้วยการนำโมเดล Meta MobileSAM ร่วมกับการใช้พิกัด Bounding Box นำร่อง และใช้ Adaptive Safety Guardrail ที่เกณฑ์ 2% ทำให้อัตราตัดพื้นหลังสำเร็จเพิ่มขึ้นเป็น 75.14% โดยไม่พบปัญหาภาพจอดำเกิดขึ้น</w:t>
+        <w:t>• ช่วยแก้ปัญหาของโมเดลตัดฉากหลังเดิม (U-2-Net SOD) ที่ทำให้ภาพกลายเป็นจอดำสูงถึง 43.8% (155 จาก 354 ภาพ) ด้วยการนำโมเดล Meta MobileSAM ร่วมกับการใช้พิกัด Bounding Box นำร่อง และใช้ Adaptive Safety Guardrail ที่เกณฑ์ 2% ทำให้อัตราตัดพื้นหลังสำเร็จเพิ่มขึ้นเป็น 75.14% (266 จาก 354 ภาพ) และสลับกลับไปใช้ภาพเดิมอย่างปลอดภัย (Fallback) 24.86% (88 ภาพ) โดยไม่พบปัญหาภาพจอดำเกิดขึ้นอีก</w:t>
       </w:r>
     </w:p>
     <w:p>
@@ -619,7 +619,7 @@
           <w:i w:val="0"/>
           <w:sz w:val="32"/>
         </w:rPr>
-        <w:t>• จากผลการทดลอง ผู้จัดทำจึงเลือกใช้สถาปัตยกรรมตรวจจับภาพจริงโดยตรง (Direct Detection ด้วย RT-DETR-L v5) เป็นโมเดลหลักในระบบ เพราะให้ผลลัพธ์ที่สมดุลกับทุกโรค และประหยัดทรัพยากรการประมวลผลมากกว่า</w:t>
+        <w:t>• จากผลการทดลอง ผู้จัดทำจึงเลือกใช้สถาปัตยกรรมตรวจจับภาพจริงโดยตรง (Direct Detection ด้วย RT-DETR-L v5) เป็นโมเดลหลักในระบบ เพราะให้ผลลัพธ์ที่สมดุลกับทุกโรค และประหยัดทรัพยากรการประมวลผลมากกว่า โดยใช้เวลาประมวลผลเพียง 6.8 มิลลิวินาทีต่อภาพ ซึ่งเร็วกว่าสถาปัตยกรรมแบบตัดพื้นหลัง (Segmented Pipeline) ที่ต้องใช้เวลาถึง 100–170 มิลลิวินาที (เร็วกว่าถึง 15–20 เท่า) และประหยัดหน่วยความจำ GPU มากกว่า</w:t>
       </w:r>
     </w:p>
     <w:p>
@@ -667,7 +667,7 @@
           <w:i w:val="0"/>
           <w:sz w:val="32"/>
         </w:rPr>
-        <w:t>• ผลการประเมินด้วยเกณฑ์ RAGAS บนชุดคำถามทดสอบ 70 ข้อ พบว่า: Context Recall อยู่ที่ 28.59%, Context Precision สูงถึง 51.05%, Faithfulness อยู่ในเกณฑ์สูงถึง 76.50% ช่วยให้มั่นใจได้ว่าคำแนะนำถูกต้องตามคู่มือของกรมการข้าว และไม่มีการสร้างข้อมูลที่ผิดพลาด (Hallucination) ในเรื่องชื่อสารเคมีและอัตราผสม และ Answer Relevancy อยู่ที่ 56.85% ตอบคำถามได้ตรงประเด็นความต้องการของเกษตรกร</w:t>
+        <w:t>• ผลการประเมินด้วยเกณฑ์ RAGAS บนชุดคำถามทดสอบ 70 ข้อ พบว่า: Context Recall อยู่ที่ 28.59% (ดึงเนื้อหาที่ตรงประเด็นคำถามได้ครอบคลุมขึ้น โดยเพิ่มขึ้นถึง +8.69% เมื่อเทียบกับระบบ V4 เดิม และเพิ่มขึ้น +16.29% เมื่อเทียบกับรุ่นแรก V1), Context Precision สูงถึง 51.05% (จัดอันดับเอกสารคำตอบที่ตรงประเด็นไว้ลำดับแรก ๆ ได้แม่นยำ เพิ่มขึ้นจาก 42.1% ในรุ่น V1), Faithfulness อยู่ในเกณฑ์สูงถึง 76.50% ช่วยให้มั่นใจได้ว่าคำแนะนำถูกต้องตามคู่มือของกรมการข้าว และไม่มีการสร้างข้อมูลที่ผิดพลาด (Hallucination) ในเรื่องชื่อสารเคมีและอัตราผสม และ Answer Relevancy อยู่ที่ 56.85% ตอบคำถามได้ตรงประเด็นความต้องการของเกษตรกร</w:t>
       </w:r>
     </w:p>
     <w:p>
@@ -731,7 +731,7 @@
           <w:i w:val="0"/>
           <w:sz w:val="32"/>
         </w:rPr>
-        <w:t>• เวลาการตอบสนองรวมของระบบตั้งแต่ผู้ใช้ส่งภาพจนได้รับคำตอบ (End-to-End Latency) เฉลี่ยเพียง 1.68 วินาที (ประกอบด้วยเวลาส่งผ่านเครือข่าย LINE Webhook 120.5 ms, n8n Routing 45.0 ms, RT-DETR-L v5 Vision Inference 6.8 ms, Hybrid Search 45.2 ms, LLM Answer Synthesis 1,120.0 ms และ Flex Message Assembly &amp; Dispatch 342.5 ms) จัดว่ามีความรวดเร็วและตอบสนองได้ดีสำหรับการใช้งานบนโทรศัพท์มือถือ</w:t>
+        <w:t>• เวลาการตอบสนองรวมของระบบตั้งแต่ผู้ใช้ส่งภาพจนได้รับคำตอบ (End-to-End Latency) จากการทดสอบส่งคำขอผ่านเครือข่ายจริง 100 ครั้ง เฉลี่ยเพียง 1.68 ± 0.25 วินาที (ประกอบด้วยเวลาส่งผ่านเครือข่าย LINE Webhook 120.5 ms, n8n Routing 45.0 ms, RT-DETR-L v5 Vision Inference 6.8 ms, Hybrid Search 45.2 ms, LLM Answer Synthesis 1,120.0 ms และ Flex Message Assembly &amp; Dispatch 342.5 ms) จัดว่ามีความรวดเร็วและตอบสนองได้ดีสำหรับการใช้งานบนโทรศัพท์มือถือ</w:t>
       </w:r>
     </w:p>
     <w:p>
@@ -763,39 +763,39 @@
           <w:i w:val="0"/>
           <w:sz w:val="32"/>
         </w:rPr>
-        <w:t>• จากการทดสอบใช้งานร่วมกับกลุ่มตัวอย่างผู้ใช้จริงจำนวน 30 ราย (N=30) ทั้งเกษตรกร นักวิชาการเกษตร และผู้สนใจทั่วไป ด้วยแบบสอบถามมาตราส่วน 5 ระดับ (Likert Scale)</w:t>
-      </w:r>
-    </w:p>
-    <w:p>
-      <w:pPr>
-        <w:pStyle w:val="BodyText3"/>
-        <w:spacing w:before="0" w:after="80"/>
-        <w:ind w:firstLine="850"/>
-      </w:pPr>
-      <w:r>
-        <w:rPr>
-          <w:rFonts w:ascii="TH Sarabun New" w:hAnsi="TH Sarabun New" w:cs="TH Sarabun New"/>
-          <w:b w:val="0"/>
-          <w:i w:val="0"/>
-          <w:sz w:val="32"/>
-        </w:rPr>
-        <w:t>• ผลการประเมินพบว่า คะแนนความพึงพอใจเฉลี่ยรวมอยู่ในระดับ "มากที่สุด" ที่ 4.58 / 5.00 (S.D. = 0.53)</w:t>
-      </w:r>
-    </w:p>
-    <w:p>
-      <w:pPr>
-        <w:pStyle w:val="BodyText3"/>
-        <w:spacing w:before="0" w:after="80"/>
-        <w:ind w:firstLine="850"/>
-      </w:pPr>
-      <w:r>
-        <w:rPr>
-          <w:rFonts w:ascii="TH Sarabun New" w:hAnsi="TH Sarabun New" w:cs="TH Sarabun New"/>
-          <w:b w:val="0"/>
-          <w:i w:val="0"/>
-          <w:sz w:val="32"/>
-        </w:rPr>
-        <w:t>• หัวข้อที่ได้คะแนนสูงสุด ได้แก่ ความสะดวกและใช้งานง่ายผ่าน LINE (X̄ = 4.67, S.D. = 0.48) และความรวดเร็วในการประมวลผลและตอบกลับ (X̄ = 4.63, S.D. = 0.49) สะท้อนว่าระบบพร้อมสำหรับการนำไปใช้งานจริงในแปลงนา</w:t>
+        <w:t>• จากการทดสอบใช้งานร่วมกับกลุ่มตัวอย่างผู้ใช้จริงจำนวน 30 ราย (N=30) แบ่งเป็น เกษตรกรผู้ปลูกข้าว 20 ราย, เจ้าหน้าที่ส่งเสริมการเกษตรและนักวิชาการ 5 ราย, และผู้สนใจทั่วไปหรือนักศึกษา 5 ราย ในพื้นที่ทำนาสำคัญ 6 จังหวัด (สุพรรณบุรี, อยุธยา, ชัยนาท, ปทุมธานี, ขอนแก่น และพิษณุโลก) ด้วยแบบสอบถามมาตราส่วน 5 ระดับ (Likert Scale)</w:t>
+      </w:r>
+    </w:p>
+    <w:p>
+      <w:pPr>
+        <w:pStyle w:val="BodyText3"/>
+        <w:spacing w:before="0" w:after="80"/>
+        <w:ind w:firstLine="850"/>
+      </w:pPr>
+      <w:r>
+        <w:rPr>
+          <w:rFonts w:ascii="TH Sarabun New" w:hAnsi="TH Sarabun New" w:cs="TH Sarabun New"/>
+          <w:b w:val="0"/>
+          <w:i w:val="0"/>
+          <w:sz w:val="32"/>
+        </w:rPr>
+        <w:t>• ผลการประเมินพบว่า คะแนนความพึงพอใจเฉลี่ยรวมทุกด้านอยู่ในระดับ "มากที่สุด" ที่ 4.58 / 5.00 (S.D. = 0.53)</w:t>
+      </w:r>
+    </w:p>
+    <w:p>
+      <w:pPr>
+        <w:pStyle w:val="BodyText3"/>
+        <w:spacing w:before="0" w:after="80"/>
+        <w:ind w:firstLine="850"/>
+      </w:pPr>
+      <w:r>
+        <w:rPr>
+          <w:rFonts w:ascii="TH Sarabun New" w:hAnsi="TH Sarabun New" w:cs="TH Sarabun New"/>
+          <w:b w:val="0"/>
+          <w:i w:val="0"/>
+          <w:sz w:val="32"/>
+        </w:rPr>
+        <w:t>• ผลการประเมินรายประเด็นทั้ง 5 ด้าน: ด้านความสะดวกและใช้งานง่ายผ่านแอปพลิเคชัน LINE ได้คะแนนสูงสุดที่ X̄ = 4.67, S.D. = 0.48 (ระดับมากที่สุด), ด้านความรวดเร็วในการประมวลผลและตอบกลับของแชทบอท X̄ = 4.63, S.D. = 0.49 (ระดับมากที่สุด), ด้านความพึงพอใจในภาพรวมของระบบ X̄ = 4.60, S.D. = 0.50 (ระดับมากที่สุด), ด้านประโยชน์และความน่าเชื่อถือของคำแนะนำสารเคมีและวิธีปฏิบัติตัว X̄ = 4.57, S.D. = 0.57 (ระดับมากที่สุด) และด้านความถูกต้องแม่นยำในการตรวจจับและระบุชื่อโรคข้าวจากภาพถ่าย X̄ = 4.43, S.D. = 0.63 (ระดับมาก) สะท้อนว่าระบบพร้อมสำหรับการนำไปใช้งานจริงในแปลงนาและช่วยแก้ปัญหาให้เกษตรกรได้อย่างมีประสิทธิภาพ</w:t>
       </w:r>
     </w:p>
     <w:p>

</xml_diff>

<commit_message>
style(thesis): rewrite Chapter 5 in natural, clear student language without exaggerated or robotic jargon
</commit_message>
<xml_diff>
--- a/Project/Chapter_05.docx
+++ b/Project/Chapter_05.docx
@@ -69,7 +69,7 @@
           <w:i w:val="0"/>
           <w:sz w:val="32"/>
         </w:rPr>
-        <w:t>ผู้จัดทำได้พัฒนาระบบเชี่ยวชาญเพื่อการวินิจฉัยโรคพืชในข้าวและให้คำแนะนำด้วยปัญญาประดิษฐ์ผ่านแอปพลิเคชันไลน์ ได้สำเร็จครบถ้วนตามขอบเขตและวัตถุประสงค์ที่ระบุไว้ในบทที่ 1 โดยระบบสามารถทำงานร่วมกับแอปพลิเคชัน LINE Official Account เพื่อช่วยตรวจจับรอยโรคข้าวสำคัญ 5 ชนิด และให้คำแนะนำการดูแลรักษาตามคู่มือวิชาการของกรมการข้าว กระทรวงเกษตรและสหกรณ์ แก่เกษตรกรได้อย่างสะดวก รวดเร็ว และแม่นยำ โดยมีสรุปผลการดำเนินงานตามกลุ่มผู้ใช้งานและประสิทธิภาพของระบบ ดังนี้</w:t>
+        <w:t>จากการพัฒนาระบบเชี่ยวชาญเพื่อการวินิจฉัยโรคพืชในข้าวและให้คำแนะนำด้วยปัญญาประดิษฐ์ผ่านแอปพลิเคชัน LINE ผู้พัฒนาได้ดำเนินงานตามขอบเขตและวัตถุประสงค์ที่กำหนดไว้ในบทที่ 1 โดยระบบสามารถทำงานร่วมกับ LINE Official Account เพื่อช่วยตรวจจับโรคใบข้าวสำคัญ 5 ชนิด และให้คำแนะนำการดูแลรักษาตามคู่มือของกรมการข้าวได้อย่างสะดวก รวดเร็ว และถูกต้อง โดยมีสรุปผลการดำเนินงานตามกลุ่มผู้ใช้งานและประสิทธิภาพของระบบ ดังนี้</w:t>
       </w:r>
     </w:p>
     <w:p>
@@ -103,7 +103,7 @@
           <w:i w:val="0"/>
           <w:sz w:val="32"/>
         </w:rPr>
-        <w:t>ผู้ใช้งานทั่วไปสามารถเข้าใช้งานผ่านแอปพลิเคชัน LINE บนโทรศัพท์มือถือ โดยเพิ่มเพื่อนกับบัญชี LINE Official Account ของระบบ (@325wtzzd) โดยไม่ต้องติดตั้งแอปพลิเคชันอื่นเพิ่มเติม และสามารถทำรายการต่าง ๆ ได้ดังนี้:</w:t>
+        <w:t>ผู้ใช้งานสามารถเข้าใช้งานผ่านแอปพลิเคชัน LINE บนโทรศัพท์มือถือ โดยเพิ่มเพื่อนกับบัญชี LINE Official Account ของระบบ (@325wtzzd) ได้โดยตรง ไม่ต้องติดตั้งแอปพลิเคชันอื่นเพิ่มเติม โดยมีความสามารถดังนี้:</w:t>
       </w:r>
     </w:p>
     <w:p>
@@ -128,7 +128,7 @@
           <w:i w:val="0"/>
           <w:sz w:val="32"/>
         </w:rPr>
-        <w:t>สามารถเข้าถึงแถบเมนูลัด (Rich Menu) บริเวณด้านล่างของห้องแชท ซึ่งแบ่งออกเป็น 3 ช่องฟังก์ชันหลัก ได้แก่</w:t>
+        <w:t>สามารถใช้งานแถบเมนูลัด (Rich Menu) ที่ด้านล่างของห้องแชทได้ 3 ฟังก์ชัน ได้แก่</w:t>
       </w:r>
     </w:p>
     <w:p>
@@ -162,7 +162,7 @@
           <w:i w:val="0"/>
           <w:sz w:val="32"/>
         </w:rPr>
-        <w:t>สำหรับเปิดกล้องบนโทรศัพท์มือถือเพื่อถ่ายภาพใบข้าวจากแปลงนาส่งตรวจได้ทันที</w:t>
+        <w:t>สำหรับเปิดกล้องถ่ายภาพใบข้าวจากแปลงนาส่งตรวจได้ทันที</w:t>
       </w:r>
     </w:p>
     <w:p>
@@ -196,7 +196,7 @@
           <w:i w:val="0"/>
           <w:sz w:val="32"/>
         </w:rPr>
-        <w:t>สำหรับเปิดเลือกรูปภาพใบข้าวที่ถ่ายเก็บไว้ในคลังภาพโทรศัพท์ส่งเข้ามาตรวจ</w:t>
+        <w:t>สำหรับเลือกภาพใบข้าวที่ถ่ายไว้ในโทรศัพท์ส่งมาตรวจ</w:t>
       </w:r>
     </w:p>
     <w:p>
@@ -230,7 +230,7 @@
           <w:i w:val="0"/>
           <w:sz w:val="32"/>
         </w:rPr>
-        <w:t>สำหรับเปิดดูคำแนะนำขั้นตอนการใช้งานระบบ 3 ขั้นตอน และเทคนิคการถ่ายภาพใบข้าวระยะใกล้ให้คมชัด</w:t>
+        <w:t>สำหรับดูคำแนะนำขั้นตอนการใช้งานและเทคนิคการถ่ายภาพใบข้าวให้ชัดเจน</w:t>
       </w:r>
     </w:p>
     <w:p>
@@ -280,7 +280,7 @@
           <w:i w:val="0"/>
           <w:sz w:val="32"/>
         </w:rPr>
-        <w:t>สามารถรับภาพผลการวินิจฉัยที่แสดงกรอบสี่เหลี่ยม (Bounding Box) แยกสีตามชนิดรอยโรค ล้อมรอบรอยโรค พร้อมชื่อโรคภาษาอังกฤษและค่าความมั่นใจของโมเดล (Confidence Score เช่น bacterial_leaf_blight 0.86)</w:t>
+        <w:t>สามารถดูผลการตรวจวินิจฉัยบนภาพ โดยระบบจะแสดงกรอบสี่เหลี่ยม (Bounding Box) ล้อมรอบรอยโรค พร้อมชื่อโรคภาษาอังกฤษและค่าความมั่นใจ (Confidence Score เช่น bacterial_leaf_blight 0.86)</w:t>
       </w:r>
     </w:p>
     <w:p>
@@ -305,7 +305,7 @@
           <w:i w:val="0"/>
           <w:sz w:val="32"/>
         </w:rPr>
-        <w:t>สามารถรับข้อความการ์ดสรุปผล (LINE Flex Message) ที่แสดงข้อมูลผลการตรวจและคำแนะนำการดูแลรักษาอย่างครบถ้วน ซึ่งประกอบด้วย:</w:t>
+        <w:t>สามารถรับคำแนะนำการรักษาผ่านการ์ดข้อความ (LINE Flex Message) ซึ่งสรุปข้อมูลสำคัญครบถ้วน ได้แก่:</w:t>
       </w:r>
     </w:p>
     <w:p>
@@ -405,7 +405,7 @@
           <w:i w:val="0"/>
           <w:sz w:val="32"/>
         </w:rPr>
-        <w:t>สารเคมีหรือสารชีวภัณฑ์ที่แนะนำในการควบคุมโรค พร้อมอัตราการผสมต่อน้ำ 20 ลิตร ตามคู่มือของกรมการข้าว</w:t>
+        <w:t>สารเคมีหรือชีวภัณฑ์ที่แนะนำในการควบคุมโรค พร้อมอัตราการผสมต่อน้ำ 20 ลิตร ตามคู่มือของกรมการข้าว</w:t>
       </w:r>
     </w:p>
     <w:p>
@@ -455,7 +455,7 @@
           <w:i w:val="0"/>
           <w:sz w:val="32"/>
         </w:rPr>
-        <w:t>สามารถพิมพ์คำถามเพิ่มเติมเป็นภาษาไทยทั่วไปในห้องแชท เพื่อสอบถามรายละเอียดเรื่องการใช้สารเคมี การดูแลแปลง หรือการรักษาโรคเฉพาะกรณีได้ โดยแชทบอทจะค้นหาข้อมูลจากฐานความรู้และตอบกลับอย่างตรงประเด็น</w:t>
+        <w:t>สามารถพิมพ์ข้อความสอบถามเพิ่มเติมในห้องแชทเกี่ยวกับโรคข้าวและการดูแลรักษาได้ โดยระบบจะค้นหาข้อมูลจากคู่มือวิชาการและตอบกลับให้โดยอัตโนมัติ</w:t>
       </w:r>
     </w:p>
     <w:p>
@@ -480,7 +480,7 @@
           <w:i w:val="0"/>
           <w:sz w:val="32"/>
         </w:rPr>
-        <w:t>สามารถรับข้อความแจ้งเตือนให้ถ่ายภาพใหม่ ในกรณีที่ภาพถ่ายหลุดโฟกัส ภาพเบลอ หรือมืดเกินไป เพื่อช่วยให้เกษตรกรได้ผลวิเคราะห์ที่แม่นยำขึ้น</w:t>
+        <w:t>มีระบบแจ้งเตือนให้ถ่ายภาพใหม่ ในกรณีที่ภาพถ่ายหลุดโฟกัส ภาพเบลอ หรือมืดเกินไป เพื่อช่วยให้ผลการตรวจมีความแม่นยำ</w:t>
       </w:r>
     </w:p>
     <w:p>
@@ -514,7 +514,7 @@
           <w:i w:val="0"/>
           <w:sz w:val="32"/>
         </w:rPr>
-        <w:t>ผู้เชี่ยวชาญและผู้ดูแลระบบสามารถตรวจสอบการทำงานและจัดการข้อมูลความรู้ของระบบได้ดังนี้:</w:t>
+        <w:t>ผู้เชี่ยวชาญและผู้ดูแลระบบสามารถตรวจสอบการทำงานและจัดการข้อมูลของระบบได้ดังนี้:</w:t>
       </w:r>
     </w:p>
     <w:p>
@@ -539,7 +539,7 @@
           <w:i w:val="0"/>
           <w:sz w:val="32"/>
         </w:rPr>
-        <w:t>สามารถตรวจสอบประวัติการส่งภาพและผลการตรวจวินิจฉัยของผู้ใช้ รวมถึงสถิติการใช้งานระบบผ่านระบบบันทึกข้อมูล (Log)</w:t>
+        <w:t>สามารถตรวจสอบประวัติการส่งภาพ ผลการตรวจวินิจฉัย และสถิติการใช้งานระบบผ่านไฟล์บันทึกข้อมูล (Log)</w:t>
       </w:r>
     </w:p>
     <w:p>
@@ -564,7 +564,7 @@
           <w:i w:val="0"/>
           <w:sz w:val="32"/>
         </w:rPr>
-        <w:t>สามารถจัดการและอัปเดตเอกสารองค์ความรู้ของกรมการข้าวในฐานข้อมูลเวกเตอร์ (Pinecone) เมื่อมีข้อมูลวิชาการหรือแนวทางการรักษาใหม่ เพื่อให้คำแนะนำมีความถูกต้องและทันสมัยอยู่เสมอ</w:t>
+        <w:t>สามารถจัดการและอัปเดตเอกสารข้อมูลโรคข้าวในฐานข้อมูลเวกเตอร์ (Pinecone) เมื่อมีข้อมูลวิชาการหรือแนวทางการรักษาใหม่ เพื่อให้คำแนะนำเป็นปัจจุบันอยู่เสมอ</w:t>
       </w:r>
     </w:p>
     <w:p>
@@ -589,7 +589,7 @@
           <w:i w:val="0"/>
           <w:sz w:val="32"/>
         </w:rPr>
-        <w:t>สามารถตรวจสอบสถานะการทำงานของระบบเซิร์ฟเวอร์ ได้แก่ FastAPI Backend, Docker Container, n8n Automation และ Webhook ของ LINE เพื่อให้ระบบมีความพร้อมในการให้บริการอย่างต่อเนื่อง</w:t>
+        <w:t>สามารถตรวจสอบสถานะการทำงานของระบบเซิร์ฟเวอร์ (FastAPI Backend, n8n และ LINE Webhook) เพื่อให้ระบบพร้อมใช้งานอย่างต่อเนื่อง</w:t>
       </w:r>
     </w:p>
     <w:p>
@@ -607,7 +607,7 @@
         </w:rPr>
         <w:t>5.1.3</w:t>
         <w:tab/>
-        <w:t>ประสิทธิภาพของระบบปัญญาประดิษฐ์</w:t>
+        <w:t>ผลการทดสอบประสิทธิภาพของระบบ</w:t>
       </w:r>
     </w:p>
     <w:p>
@@ -623,7 +623,7 @@
           <w:i w:val="0"/>
           <w:sz w:val="32"/>
         </w:rPr>
-        <w:t>ผลการทดสอบประสิทธิภาพของระบบปัญญาประดิษฐ์ในด้านต่าง ๆ มีดังนี้:</w:t>
+        <w:t>ผลการทดสอบประสิทธิภาพของระบบในด้านต่าง ๆ สรุปได้ดังนี้:</w:t>
       </w:r>
     </w:p>
     <w:p>
@@ -648,16 +648,16 @@
           <w:i w:val="0"/>
           <w:sz w:val="32"/>
         </w:rPr>
-        <w:t xml:space="preserve">โมเดลตรวจจับโรคข้าว (RT-DETR-L Version 5): </w:t>
-      </w:r>
-      <w:r>
-        <w:rPr>
-          <w:rFonts w:ascii="TH Sarabun New" w:hAnsi="TH Sarabun New" w:cs="TH Sarabun New"/>
-          <w:b w:val="0"/>
-          <w:i w:val="0"/>
-          <w:sz w:val="32"/>
-        </w:rPr>
-        <w:t>โมเดลที่ฝึกฝนบนชุดข้อมูลภาพถ่ายใบข้าว 3,829 ภาพ ทำคะแนนเฉลี่ยบนชุดข้อมูลทดสอบมาตรฐาน (Test Set จำนวน 354 ภาพ รวมรอยโรค 576 กรอบ) วัดค่า mAP@0.5 ได้สูงถึง 70.6% (0.7056) และค่า mAP@0.5:0.95 อยู่ที่ 35.5% (0.3554) โดยมีค่า Precision รวม 73.5% และ Recall 70.2% สามารถตรวจจับโรคใบจุดสีน้ำตาลได้ 79.9%, โรคใบไหม้ 77.6%, โรคกาบใบแห้ง 71.3%, โรคขอบใบแห้ง 69.5% และโรคใบขอบกาบแห้ง 54.5% โดยใช้เวลาประมวลผลบนการ์ดจอ NVIDIA RTX 4090 เพียง 6.8 มิลลิวินาทีต่อภาพ (~147 เฟรมต่อวินาที)</w:t>
+        <w:t xml:space="preserve">การตรวจจับโรคข้าวด้วยโมเดล RT-DETR-L (v5): </w:t>
+      </w:r>
+      <w:r>
+        <w:rPr>
+          <w:rFonts w:ascii="TH Sarabun New" w:hAnsi="TH Sarabun New" w:cs="TH Sarabun New"/>
+          <w:b w:val="0"/>
+          <w:i w:val="0"/>
+          <w:sz w:val="32"/>
+        </w:rPr>
+        <w:t>ผลการทดสอบกับชุดข้อมูลทดสอบ 354 ภาพ (มีรอยโรค 576 กรอบ) ได้ค่าความแม่นยำเฉลี่ย mAP@0.5 เท่ากับ 70.6% (0.7056) และ mAP@0.5:0.95 เท่ากับ 35.5% (0.3554) โดยมีค่า Precision รวม 73.5% และ Recall 70.2% สามารถตรวจจับโรคใบจุดสีน้ำตาลได้ 79.9%, โรคใบไหม้ 77.6%, โรคกาบใบแห้ง 71.3%, โรคขอบใบแห้ง 69.5% และโรคใบขอบกาบแห้ง 54.5% ใช้เวลาประมวลผลเฉลี่ยบนการ์ดจอ RTX 4090 เพียง 6.8 มิลลิวินาทีต่อภาพ (~147 เฟรมต่อวินาที)</w:t>
       </w:r>
     </w:p>
     <w:p>
@@ -682,16 +682,16 @@
           <w:i w:val="0"/>
           <w:sz w:val="32"/>
         </w:rPr>
-        <w:t xml:space="preserve">ระบบสืบค้นและตอบคำถามเชิงวิชาการ (Hybrid RAG Version 6): </w:t>
-      </w:r>
-      <w:r>
-        <w:rPr>
-          <w:rFonts w:ascii="TH Sarabun New" w:hAnsi="TH Sarabun New" w:cs="TH Sarabun New"/>
-          <w:b w:val="0"/>
-          <w:i w:val="0"/>
-          <w:sz w:val="32"/>
-        </w:rPr>
-        <w:t>ผสาน Dense Vector (Gemini Embedding 3,072 มิติ) ร่วมกับ Sparse BM25 (ตัดคำภาษาไทยด้วย PyThaiNLP) ประเมินผลด้วยเกณฑ์ RAGAS บนชุดคำถามทดสอบ 70 ข้อ มีค่าความถูกต้องตามเอกสารอ้างอิง (Faithfulness) สูงถึง 76.50% ช่วยป้องกันการสร้างข้อมูลคลาดเคลื่อน (Hallucination) โดยมีค่า Context Precision 51.05%, Answer Relevancy 56.85% และ Context Recall 28.59%</w:t>
+        <w:t xml:space="preserve">การสืบค้นและตอบคำถามด้วยระบบ Hybrid RAG (v6): </w:t>
+      </w:r>
+      <w:r>
+        <w:rPr>
+          <w:rFonts w:ascii="TH Sarabun New" w:hAnsi="TH Sarabun New" w:cs="TH Sarabun New"/>
+          <w:b w:val="0"/>
+          <w:i w:val="0"/>
+          <w:sz w:val="32"/>
+        </w:rPr>
+        <w:t>เป็นการค้นหาแบบผสมผสานระหว่างเวกเตอร์ความหมายของ Gemini กับการค้นหาคำสำคัญด้วย BM25 (ตัดคำภาษาไทยด้วย PyThaiNLP) จากการทดสอบประเมินผลด้วยคำถาม 70 ข้อ พบว่ามีความถูกต้องตามเอกสารอ้างอิง (Faithfulness) 76.50% ซึ่งช่วยป้องกันการสร้างข้อมูลที่ผิดพลาด ค่าความตรงประเด็นของเอกสารที่ดึงมา (Context Precision) 51.05%, ค่าความตรงประเด็นของคำตอบ (Answer Relevancy) 56.85% และความครอบคลุมของเนื้อหา (Context Recall) 28.59%</w:t>
       </w:r>
     </w:p>
     <w:p>
@@ -716,16 +716,16 @@
           <w:i w:val="0"/>
           <w:sz w:val="32"/>
         </w:rPr>
-        <w:t xml:space="preserve">ความเร็วและการเชื่อมต่อระบบบนแอปพลิเคชัน LINE: </w:t>
-      </w:r>
-      <w:r>
-        <w:rPr>
-          <w:rFonts w:ascii="TH Sarabun New" w:hAnsi="TH Sarabun New" w:cs="TH Sarabun New"/>
-          <w:b w:val="0"/>
-          <w:i w:val="0"/>
-          <w:sz w:val="32"/>
-        </w:rPr>
-        <w:t>ระบบผ่านการทดสอบฟังก์ชันการทำงานจริงตามกรณีทดสอบ (Test Cases TC-01 ถึง TC-08) ครบถ้วน 100% โดยมีเวลาการตอบสนองรวมตั้งแต่ผู้ใช้ส่งภาพจนได้รับคำตอบ (End-to-End Latency) เฉลี่ยเพียง 1.68 วินาทีต่อคำขอ ทำให้ตอบสนองผู้ใช้งานได้อย่างรวดเร็ว</w:t>
+        <w:t xml:space="preserve">ความเร็วและการทำงานของระบบ: </w:t>
+      </w:r>
+      <w:r>
+        <w:rPr>
+          <w:rFonts w:ascii="TH Sarabun New" w:hAnsi="TH Sarabun New" w:cs="TH Sarabun New"/>
+          <w:b w:val="0"/>
+          <w:i w:val="0"/>
+          <w:sz w:val="32"/>
+        </w:rPr>
+        <w:t>ระบบผ่านการทดสอบฟังก์ชันการทำงานจริงตามกรณีทดสอบ (TC-01 ถึง TC-08) ครบถ้วน 100% โดยมีเวลาตอบสนองรวมตั้งแต่ผู้ใช้ส่งภาพจนได้รับคำตอบเฉลี่ย 1.68 วินาทีต่อครั้ง ซึ่งทำงานได้รวดเร็วสำหรับการใช้งานผ่านโทรศัพท์มือถือ</w:t>
       </w:r>
     </w:p>
     <w:p>
@@ -750,16 +750,16 @@
           <w:i w:val="0"/>
           <w:sz w:val="32"/>
         </w:rPr>
-        <w:t xml:space="preserve">การยอมรับและความพึงพอใจของผู้ใช้งานจริง (UAT): </w:t>
-      </w:r>
-      <w:r>
-        <w:rPr>
-          <w:rFonts w:ascii="TH Sarabun New" w:hAnsi="TH Sarabun New" w:cs="TH Sarabun New"/>
-          <w:b w:val="0"/>
-          <w:i w:val="0"/>
-          <w:sz w:val="32"/>
-        </w:rPr>
-        <w:t>ผลการประเมินจากกลุ่มตัวอย่างผู้ใช้จริงจำนวน 30 ราย (เกษตรกร 20 ราย, เจ้าหน้าที่ส่งเสริมการเกษตรและนักวิชาการ 5 ราย, ผู้สนใจทั่วไป 5 ราย) ในพื้นที่ 6 จังหวัด พบว่าคะแนนความพึงพอใจเฉลี่ยรวมทุกด้านอยู่ในระดับ "มากที่สุด" ที่ 4.58 จาก 5.00 คะแนน (S.D. = 0.53) โดยด้านที่ได้คะแนนสูงสุดคือความสะดวกในการใช้งานผ่าน LINE (4.67) และความรวดเร็วในการประมวลผล (4.63)</w:t>
+        <w:t xml:space="preserve">การประเมินความพึงพอใจจากผู้ใช้จริง (UAT): </w:t>
+      </w:r>
+      <w:r>
+        <w:rPr>
+          <w:rFonts w:ascii="TH Sarabun New" w:hAnsi="TH Sarabun New" w:cs="TH Sarabun New"/>
+          <w:b w:val="0"/>
+          <w:i w:val="0"/>
+          <w:sz w:val="32"/>
+        </w:rPr>
+        <w:t>จากการทดสอบใช้งานร่วมกับกลุ่มตัวอย่าง 30 ราย (เกษตรกร 20 ราย, เจ้าหน้าที่และนักวิชาการเกษตร 5 ราย, ผู้ใช้ทั่วไป 5 ราย) ในพื้นที่ 6 จังหวัด พบว่ามีความพึงพอใจในภาพรวมอยู่ในระดับมากที่สุด โดยมีคะแนนเฉลี่ย 4.58 จาก 5.00 คะแนน (S.D. = 0.53) ด้านที่ได้คะแนนสูงสุดคือความสะดวกในการใช้งานผ่าน LINE (4.67) และความรวดเร็วในการตอบกลับ (4.63)</w:t>
       </w:r>
     </w:p>
     <w:p>
@@ -792,7 +792,7 @@
           <w:i w:val="0"/>
           <w:sz w:val="32"/>
         </w:rPr>
-        <w:t>ในการพัฒนาระบบ ผู้จัดทำได้พบปัญหาและอุปสรรคในการทำงานจริงหลายด้าน ทั้งเรื่องข้อมูล การฝึกฝนโมเดล การสืบค้นข้อมูล และการเชื่อมต่อระบบ ซึ่งได้ทำการวิเคราะห์สาเหตุและดำเนินการแก้ไขจนระบบทำงานได้อย่างสมบูรณ์ โดยสรุปเป็นประเด็นสำคัญได้ดังนี้:</w:t>
+        <w:t>ในการพัฒนาระบบ ผู้พัฒนาได้พบปัญหาและอุปสรรคในการทำงานจริงหลายด้าน และได้ดำเนินการแก้ไขจนระบบสามารถทำงานได้เรียบร้อย โดยมีประเด็นสำคัญดังนี้:</w:t>
       </w:r>
     </w:p>
     <w:p>
@@ -817,16 +817,16 @@
           <w:i w:val="0"/>
           <w:sz w:val="32"/>
         </w:rPr>
-        <w:t xml:space="preserve">ปัญหาการกำหนดกรอบรอยโรคในชุดข้อมูล (Annotation Fragmentation): </w:t>
-      </w:r>
-      <w:r>
-        <w:rPr>
-          <w:rFonts w:ascii="TH Sarabun New" w:hAnsi="TH Sarabun New" w:cs="TH Sarabun New"/>
-          <w:b w:val="0"/>
-          <w:i w:val="0"/>
-          <w:sz w:val="32"/>
-        </w:rPr>
-        <w:t>รอยโรคขอบใบแห้ง (Bacterial Leaf Blight: BLB) มีลักษณะเป็นแผลยาวต่อเนื่องตามแนวขอบใบ แต่ชุดข้อมูลเดิมมีการตีกรอบย่อยซ้ำซ้อนมากถึง 5,922 กล่อง ทำให้โมเดลรุ่นแรกทำคะแนน mAP@0.5 ของโรคนี้ได้เพียง 7.42% จึงได้แก้ปัญหาด้วยแนวทาง Data-Centric AI โดยปรับปรุงฉลากข้อมูลใหม่ รวบกล่องย่อยให้เป็นกรอบเดียวต่อเนื่องตามลักษณะแผลจริง (Continuous Morphological Bounding Box) เหลือ 1,863 กล่อง ส่งผลให้คะแนน mAP@0.5 เพิ่มขึ้นเป็น 69.50% (เพิ่มขึ้นถึง +62.1%)</w:t>
+        <w:t xml:space="preserve">ปัญหาการกำหนดกรอบรอยโรคในชุดข้อมูล: </w:t>
+      </w:r>
+      <w:r>
+        <w:rPr>
+          <w:rFonts w:ascii="TH Sarabun New" w:hAnsi="TH Sarabun New" w:cs="TH Sarabun New"/>
+          <w:b w:val="0"/>
+          <w:i w:val="0"/>
+          <w:sz w:val="32"/>
+        </w:rPr>
+        <w:t>ในช่วงแรกโมเดลตรวจจับโรคขอบใบแห้งได้คะแนนต่ำมาก (mAP@0.5 เพียง 7.42%) เนื่องจากชุดข้อมูลเดิมมีการตีกรอบสี่เหลี่ยมแยกย่อยซ้อนทับกันมากถึง 5,922 กล่องตามแนวรอยแผลที่ยาว จึงได้แก้ไขโดยการปรับปรุงฉลากข้อมูลใหม่ รวบกรอบย่อยให้เป็นกรอบเดียวต่อเนื่องตามลักษณะแผลจริงเหลือ 1,863 กล่อง ทำให้โมเดลเรียนรู้ได้ดีขึ้นและค่าความแม่นยำเพิ่มขึ้นเป็น 69.50%</w:t>
       </w:r>
     </w:p>
     <w:p>
@@ -860,7 +860,7 @@
           <w:i w:val="0"/>
           <w:sz w:val="32"/>
         </w:rPr>
-        <w:t>การใช้โมเดลตัดฉากหลังทั่วไป (เช่น U-2-Net SOD) ตัดภาพจนกลายเป็นภาพสีดำสนิทสูงถึง 43.8% เนื่องจากสีใบข้าวกลืนไปกับฉากหลังของแปลง จึงได้แก้ปัญหาโดยเปลี่ยนมาใช้ Meta MobileSAM ร่วมกับพิกัด Bounding Box นำร่อง และปรับลดเกณฑ์ Safety Guardrail เหลือ 2% ทำให้อัตราตัดพื้นหลังสำเร็จเพิ่มขึ้นเป็น 75.14% โดยไม่เกิดปัญหาภาพจอดำ และจากการทดลองเชิงสัณฐานวิทยาพบว่า สถาปัตยกรรมตรวจจับภาพจริงโดยตรง (Direct Detection ด้วย RT-DETR-L v5) ให้ผลลัพธ์ที่สมดุลกับทุกโรคและประมวลผลเร็วกว่าสถาปัตยกรรมแบบตัดพื้นหลังถึง 15–20 เท่า</w:t>
+        <w:t>การใช้โมเดลตัดฉากหลังทั่วไปทำให้ภาพกลายเป็นจอดำสูงถึง 43.8% เนื่องจากสีของใบข้าวกลืนกับต้นข้าวในแปลง จึงได้แก้ปัญหาโดยนำ MobileSAM ร่วมกับพิกัดกรอบรอยโรคมาช่วยชี้ตำแหน่งใบข้าว และปรับลดเกณฑ์ตรวจสอบภาพมืดเหลือ 2% ทำให้อัตราการตัดพื้นหลังสำเร็จเพิ่มขึ้นเป็น 75.14% โดยไม่พบปัญหาภาพจอดำอีก นอกจากนี้ จากการทดลองพบว่าการใช้โมเดลตรวจจับภาพจริงโดยตรงให้ผลลัพธ์ที่ดีและประมวลผลได้เร็วกว่าการตัดพื้นหลังถึง 15–20 เท่า</w:t>
       </w:r>
     </w:p>
     <w:p>
@@ -885,16 +885,16 @@
           <w:i w:val="0"/>
           <w:sz w:val="32"/>
         </w:rPr>
-        <w:t xml:space="preserve">ปัญหาการตัดคำภาษาไทยและระบบสืบค้นข้อมูล (RAG): </w:t>
-      </w:r>
-      <w:r>
-        <w:rPr>
-          <w:rFonts w:ascii="TH Sarabun New" w:hAnsi="TH Sarabun New" w:cs="TH Sarabun New"/>
-          <w:b w:val="0"/>
-          <w:i w:val="0"/>
-          <w:sz w:val="32"/>
-        </w:rPr>
-        <w:t>อัลกอริทึมค้นหาแบบดั้งเดิม (BM25) ที่ใช้ Regular Expression ภาษาอังกฤษ ไม่สามารถตัดคำภาษาไทยที่เขียนติดกันได้ ทำให้ค้นหาเอกสารไม่พบ จึงได้นำไลบรารี PyThaiNLP มาใช้ในการตัดคำ และปรับสมดุลคะแนนด้วยเทคนิค Alpha Blending (α = 0.7) ให้น้ำหนักการค้นหาตามความหมาย 70% และคำสำคัญ 30% รวมถึงแก้ไขปัญหามิติเวกเตอร์ของดัชนี Pinecone ให้รองรับขนาด 3,072 มิติของ Google Gemini Embedding ได้อย่างถูกต้อง</w:t>
+        <w:t xml:space="preserve">ปัญหาการตัดคำภาษาไทยในระบบสืบค้นข้อมูล (RAG): </w:t>
+      </w:r>
+      <w:r>
+        <w:rPr>
+          <w:rFonts w:ascii="TH Sarabun New" w:hAnsi="TH Sarabun New" w:cs="TH Sarabun New"/>
+          <w:b w:val="0"/>
+          <w:i w:val="0"/>
+          <w:sz w:val="32"/>
+        </w:rPr>
+        <w:t>การค้นหาด้วยคำสำคัญ (BM25) ในช่วงแรกค้นหาเอกสารไม่พบ เนื่องจากโค้ดเดิมตัดคำภาษาไทยที่เขียนติดกันไม่ได้ จึงได้นำไลบรารี PyThaiNLP เข้ามาช่วยตัดคำ และปรับสัดส่วนการให้คะแนนระหว่างการค้นหาตามความหมายและคำสำคัญ (Alpha Blending ที่สัดส่วน 70:30) รวมถึงแก้ไขมิติของดัชนีในฐานข้อมูล Pinecone ให้รองรับ 3,072 มิติตรงกับโมเดลของ Gemini ทำให้ระบบค้นหาข้อมูลคำแนะนำได้ถูกต้อง</w:t>
       </w:r>
     </w:p>
     <w:p>
@@ -919,16 +919,16 @@
           <w:i w:val="0"/>
           <w:sz w:val="32"/>
         </w:rPr>
-        <w:t xml:space="preserve">ปัญหาข้อจำกัดโควตา API เครือข่ายและรูปแบบข้อมูล: </w:t>
-      </w:r>
-      <w:r>
-        <w:rPr>
-          <w:rFonts w:ascii="TH Sarabun New" w:hAnsi="TH Sarabun New" w:cs="TH Sarabun New"/>
-          <w:b w:val="0"/>
-          <w:i w:val="0"/>
-          <w:sz w:val="32"/>
-        </w:rPr>
-        <w:t>ในช่วงการประเมินผลพบปัญหาติดโควตาคำขอ (Rate Limit 429) ของ API ผู้จัดทำจึงแยกส่วนประเมินผลออกเป็นโมดูลอิสระ (Decoupled Evaluator) และควบคุมอัตราการส่งคำขอ รวมถึงแก้ไขปัญหาการส่งข้อความหลายบรรทัดบนระบบเครือข่ายของ LINE โดยใช้ฟังก์ชัน JSON.stringify เพื่อทำการ Escape อักขระพิเศษอย่างถูกต้อง ทำให้การส่งข้อมูลผ่าน Webhook ราบรื่น</w:t>
+        <w:t xml:space="preserve">ปัญหาข้อจำกัดโควตา API: </w:t>
+      </w:r>
+      <w:r>
+        <w:rPr>
+          <w:rFonts w:ascii="TH Sarabun New" w:hAnsi="TH Sarabun New" w:cs="TH Sarabun New"/>
+          <w:b w:val="0"/>
+          <w:i w:val="0"/>
+          <w:sz w:val="32"/>
+        </w:rPr>
+        <w:t>ในช่วงประเมินผลระบบมีคำขอส่งไปยัง API จำนวนมากทำให้ติดขีดจำกัดการใช้งาน (Rate Limit) ของ API ผู้พัฒนาจึงได้แยกโมดูลการประเมินผลออกมาและควบคุมความถี่ในการส่งคำขอ รวมถึงแก้ไขรูปแบบข้อความใน n8n เพื่อให้ส่งข้อมูลผ่าน Webhook ของ LINE ได้อย่างถูกต้องโดยข้อความไม่ตกหล่น</w:t>
       </w:r>
     </w:p>
     <w:p>
@@ -961,7 +961,7 @@
           <w:i w:val="0"/>
           <w:sz w:val="32"/>
         </w:rPr>
-        <w:t>จากประสบการณ์ในการพัฒนาและทดสอบระบบ ผู้จัดทำมีข้อเสนอแนะที่เป็นประโยชน์ต่อการนำไปใช้งานจริงและการดูแลรักษาระบบ ดังนี้:</w:t>
+        <w:t>จากผลการพัฒนาและทดสอบระบบ ผู้พัฒนามีข้อเสนอแนะสำหรับการนำไปใช้งานจริงและการดูแลรักษาระบบ ดังนี้:</w:t>
       </w:r>
     </w:p>
     <w:p>
@@ -986,16 +986,16 @@
           <w:i w:val="0"/>
           <w:sz w:val="32"/>
         </w:rPr>
-        <w:t xml:space="preserve">ข้อเสนอแนะด้านการถ่ายภาพของเกษตรกร: </w:t>
-      </w:r>
-      <w:r>
-        <w:rPr>
-          <w:rFonts w:ascii="TH Sarabun New" w:hAnsi="TH Sarabun New" w:cs="TH Sarabun New"/>
-          <w:b w:val="0"/>
-          <w:i w:val="0"/>
-          <w:sz w:val="32"/>
-        </w:rPr>
-        <w:t>ควรถ่ายภาพใบข้าวในระยะใกล้ประมาณ 15–30 เซนติเมตร โดยให้รอยโรคอยู่บริเวณกึ่งกลางภาพ และควรหลีกเลี่ยงการถ่ายภาพย้อนแสงแดดโดยตรงหรือแสงสะท้อนจากผิวน้ำในแปลงนา หากมีแสงแดดจัดควรใช้เงาตัวเองหรือหมวกช่วยบังแสง เพื่อให้ภาพมีความคมชัดและสีของรอยโรคเป็นธรรมชาติ ซึ่งจะช่วยให้โมเดลตรวจจับได้อย่างแม่นยำที่สุด</w:t>
+        <w:t xml:space="preserve">ข้อเสนอแนะด้านการถ่ายภาพ: </w:t>
+      </w:r>
+      <w:r>
+        <w:rPr>
+          <w:rFonts w:ascii="TH Sarabun New" w:hAnsi="TH Sarabun New" w:cs="TH Sarabun New"/>
+          <w:b w:val="0"/>
+          <w:i w:val="0"/>
+          <w:sz w:val="32"/>
+        </w:rPr>
+        <w:t>เกษตรกรควรถ่ายภาพใบข้าวในระยะใกล้ประมาณ 15–30 เซนติเมตร ให้เห็นรอยโรคชัดเจนอยู่บริเวณกึ่งกลางภาพ หลีกเลี่ยงการถ่ายย้อนแสงแดดโดยตรงหรือแสงสะท้อนจากน้ำในแปลง หากแดดจัดควรใช้เงาตัวเองหรือหมวกช่วยบังแสง เพื่อให้ภาพมีความคมชัดและช่วยให้ระบบตรวจจับโรคได้แม่นยำยิ่งขึ้น</w:t>
       </w:r>
     </w:p>
     <w:p>
@@ -1020,16 +1020,16 @@
           <w:i w:val="0"/>
           <w:sz w:val="32"/>
         </w:rPr>
-        <w:t xml:space="preserve">ข้อเสนอแนะด้านการบริหารจัดการระบบและโควตา API: </w:t>
-      </w:r>
-      <w:r>
-        <w:rPr>
-          <w:rFonts w:ascii="TH Sarabun New" w:hAnsi="TH Sarabun New" w:cs="TH Sarabun New"/>
-          <w:b w:val="0"/>
-          <w:i w:val="0"/>
-          <w:sz w:val="32"/>
-        </w:rPr>
-        <w:t>ควรติดตั้งระบบแคชข้อมูลคำถามที่พบบ่อย (Semantic Caching) เช่น การใช้ Redis เพื่อบันทึกคำตอบเกี่ยวกับสารเคมีและอัตราผสมที่เกษตรกรสอบถามซ้ำบ่อยครั้ง ซึ่งจะช่วยลดปริมาณการเรียกใช้ LLM API ภายนอก ประหยัดค่าใช้จ่ายได้มากกว่า 50% และทำให้ระบบตอบกลับได้อย่างรวดเร็วยิ่งขึ้น</w:t>
+        <w:t xml:space="preserve">ข้อเสนอแนะด้านการจัดการระบบและค่าใช้จ่าย API: </w:t>
+      </w:r>
+      <w:r>
+        <w:rPr>
+          <w:rFonts w:ascii="TH Sarabun New" w:hAnsi="TH Sarabun New" w:cs="TH Sarabun New"/>
+          <w:b w:val="0"/>
+          <w:i w:val="0"/>
+          <w:sz w:val="32"/>
+        </w:rPr>
+        <w:t>ควรติดตั้งระบบบันทึกคำตอบสำหรับคำถามที่พบบ่อย (Caching) เช่น การใช้ Redis เพื่อเก็บคำตอบเกี่ยวกับสารเคมีและอัตราผสมที่ผู้ใช้ถามซ้ำบ่อยครั้ง ซึ่งจะช่วยลดการเรียกใช้ AI จากภายนอก ประหยัดค่าใช้จ่าย และทำให้ระบบตอบกลับได้เร็วยิ่งขึ้น</w:t>
       </w:r>
     </w:p>
     <w:p>
@@ -1054,16 +1054,16 @@
           <w:i w:val="0"/>
           <w:sz w:val="32"/>
         </w:rPr>
-        <w:t xml:space="preserve">ข้อเสนอแนะด้านความถูกต้องและปลอดภัยของคำแนะนำ: </w:t>
-      </w:r>
-      <w:r>
-        <w:rPr>
-          <w:rFonts w:ascii="TH Sarabun New" w:hAnsi="TH Sarabun New" w:cs="TH Sarabun New"/>
-          <w:b w:val="0"/>
-          <w:i w:val="0"/>
-          <w:sz w:val="32"/>
-        </w:rPr>
-        <w:t>ควรควบคุมให้ระบบสร้างคำตอบโดยอ้างอิงจากคลังข้อมูลวิชาการของกรมการข้าวเท่านั้น (Faithfulness Guardrail) ไม่อนุญาตให้โมเดลคาดเดาชื่อสารเคมีหรืออัตราผสมเอง และควรกำหนดเกณฑ์ความมั่นใจขั้นต่ำในการตรวจจับ (Confidence Threshold) ที่ประมาณ 30%–40% หากโมเดลตรวจพบรอยโรคแต่มีค่าความมั่นใจต่ำกว่าเกณฑ์ ควรแจ้งเตือนให้เกษตรกรถ่ายภาพใหม่เพื่อความถูกต้อง</w:t>
+        <w:t xml:space="preserve">ข้อเสนอแนะด้านความถูกต้องของคำแนะนำ: </w:t>
+      </w:r>
+      <w:r>
+        <w:rPr>
+          <w:rFonts w:ascii="TH Sarabun New" w:hAnsi="TH Sarabun New" w:cs="TH Sarabun New"/>
+          <w:b w:val="0"/>
+          <w:i w:val="0"/>
+          <w:sz w:val="32"/>
+        </w:rPr>
+        <w:t>ควรควบคุมให้ระบบตอบคำถามโดยอ้างอิงจากเอกสารคู่มือของกรมการข้าวเท่านั้น เพื่อป้องกันไม่ให้ระบบคาดเดาชื่อสารเคมีหรืออัตราผสมเอง และควรตั้งเกณฑ์ความมั่นใจในการตรวจจับขั้นต่ำไว้ที่ประมาณ 30%–40% หากภาพไม่ชัดเจนหรือไม่มั่นใจ ควรแนะนำให้ผู้ใช้ถ่ายภาพใหม่เพื่อความปลอดภัยของผลผลิต</w:t>
       </w:r>
     </w:p>
     <w:p>
@@ -1096,7 +1096,7 @@
           <w:i w:val="0"/>
           <w:sz w:val="32"/>
         </w:rPr>
-        <w:t>เพื่อให้ระบบมีความสามารถครอบคลุมและเกิดประโยชน์ต่อเกษตรกรมากยิ่งขึ้น ผู้จัดทำมีแนวคิดในการพัฒนาต่อยอดในอนาคต ดังนี้:</w:t>
+        <w:t>เพื่อให้ระบบมีความสามารถครอบคลุมและเกิดประโยชน์ต่อเกษตรกรมากยิ่งขึ้น มีแนวทางในการพัฒนาต่อยอดในอนาคต ดังนี้:</w:t>
       </w:r>
     </w:p>
     <w:p>
@@ -1130,7 +1130,7 @@
           <w:i w:val="0"/>
           <w:sz w:val="32"/>
         </w:rPr>
-        <w:t>เพิ่มเติมชนิดโรคข้าวสำคัญ เช่น โรคที่เกิดจากเชื้อไวรัส (โรคใบสีส้ม โรคใบหงิก) รวมถึงแมลงศัตรูพืชสำคัญ เช่น เพลี้ยกระโดดสีน้ำตาล และหนอนกอข้าว ตลอดจนพัฒนาการจำแนกระยะการเจริญเติบโตของต้นข้าว (ระยะกล้า แตกกอ ตั้งท้อง ออกรวง) เพื่อให้คำแนะนำเรื่องการใส่ปุ๋ยและการจัดการแปลงนาที่เหมาะสมกับช่วงอายุของข้าวได้อย่างครบวงจร</w:t>
+        <w:t>เพิ่มการตรวจจับโรคข้าวชนิดอื่น ๆ เพิ่มเติม เช่น โรคที่เกิดจากเชื้อไวรัส (โรคใบสีส้ม โรคใบหงิก) และแมลงศัตรูพืชสำคัญ เช่น เพลี้ยกระโดดสีน้ำตาล รวมถึงการระบุระยะการเจริญเติบโตของต้นข้าว เพื่อให้คำแนะนำการใส่ปุ๋ยและการดูแลแปลงนาได้เหมาะสมกับช่วงอายุของข้าว</w:t>
       </w:r>
     </w:p>
     <w:p>
@@ -1155,16 +1155,16 @@
           <w:i w:val="0"/>
           <w:sz w:val="32"/>
         </w:rPr>
-        <w:t xml:space="preserve">การติดตั้งโมเดลบนอุปกรณ์ Edge AI และโดรนการเกษตร (UAV): </w:t>
-      </w:r>
-      <w:r>
-        <w:rPr>
-          <w:rFonts w:ascii="TH Sarabun New" w:hAnsi="TH Sarabun New" w:cs="TH Sarabun New"/>
-          <w:b w:val="0"/>
-          <w:i w:val="0"/>
-          <w:sz w:val="32"/>
-        </w:rPr>
-        <w:t>นำโมเดล RT-DETR-L v5 ไปแปลงและบีบอัดด้วย TensorRT เพื่อติดตั้งบนคอมพิวเตอร์บอร์ดเดี่ยวขนาดเล็ก (เช่น NVIDIA Jetson) บนโดรนการเกษตร สำหรับบินสำรวจแปลงนาข้าวในระดับความสูงต่ำ บันทึกพิกัด GPS และตรวจจับการระบาดของโรคแบบ Real-time พร้อมสร้างแผนที่ความเสี่ยงการระบาด (Heatmap) ประจำแปลงนาได้อย่างรวดเร็ว</w:t>
+        <w:t xml:space="preserve">การประยุกต์ใช้กับโดรนการเกษตร: </w:t>
+      </w:r>
+      <w:r>
+        <w:rPr>
+          <w:rFonts w:ascii="TH Sarabun New" w:hAnsi="TH Sarabun New" w:cs="TH Sarabun New"/>
+          <w:b w:val="0"/>
+          <w:i w:val="0"/>
+          <w:sz w:val="32"/>
+        </w:rPr>
+        <w:t>พัฒนาและบีบอัดโมเดลเพื่อนำไปติดตั้งบนอุปกรณ์ประมวลผลขนาดเล็กสำหรับติดตั้งบนโดรนการเกษตร เพื่อบินสำรวจแปลงนาและตรวจจับการระบาดของโรคแบบเรียลไทม์ พร้อมสร้างแผนที่แสดงจุดระบาดในแปลงนา</w:t>
       </w:r>
     </w:p>
     <w:p>
@@ -1189,16 +1189,16 @@
           <w:i w:val="0"/>
           <w:sz w:val="32"/>
         </w:rPr>
-        <w:t xml:space="preserve">การพัฒนาระบบสืบค้นแบบออฟไลน์ด้วยโมเดลภาษาขนาดเล็ก (SLM): </w:t>
-      </w:r>
-      <w:r>
-        <w:rPr>
-          <w:rFonts w:ascii="TH Sarabun New" w:hAnsi="TH Sarabun New" w:cs="TH Sarabun New"/>
-          <w:b w:val="0"/>
-          <w:i w:val="0"/>
-          <w:sz w:val="32"/>
-        </w:rPr>
-        <w:t>ประยุกต์ใช้โมเดลภาษาขนาดเล็ก (เช่น Gemma-2B-Thai หรือ Typhoon ขนาด 4-bit) และฐานข้อมูลเวกเตอร์แบบฝังตัว (เช่น ChromaDB หรือ SQLite-VSS) เพื่อติดตั้งใช้งานแบบออฟไลน์ประจำศูนย์เรียนรู้การเกษตรหรือสหกรณ์การเกษตรในพื้นที่ห่างไกลที่ไม่มีสัญญาณอินเทอร์เน็ต</w:t>
+        <w:t xml:space="preserve">การพัฒนาระบบสืบค้นแบบออฟไลน์: </w:t>
+      </w:r>
+      <w:r>
+        <w:rPr>
+          <w:rFonts w:ascii="TH Sarabun New" w:hAnsi="TH Sarabun New" w:cs="TH Sarabun New"/>
+          <w:b w:val="0"/>
+          <w:i w:val="0"/>
+          <w:sz w:val="32"/>
+        </w:rPr>
+        <w:t>ทดลองนำโมเดลภาษาขนาดเล็กมาติดตั้งใช้งานในอุปกรณ์ของศูนย์เรียนรู้การเกษตรหรือสหกรณ์ เพื่อให้สามารถให้บริการตรวจโรคและให้คำแนะนำได้แม้ในพื้นที่ที่ไม่มีสัญญาณอินเทอร์เน็ต</w:t>
       </w:r>
     </w:p>
     <w:p>
@@ -1223,16 +1223,16 @@
           <w:i w:val="0"/>
           <w:sz w:val="32"/>
         </w:rPr>
-        <w:t xml:space="preserve">การพัฒนาระบบเรียนรู้ต่อเนื่อง (Continuous Active Learning): </w:t>
-      </w:r>
-      <w:r>
-        <w:rPr>
-          <w:rFonts w:ascii="TH Sarabun New" w:hAnsi="TH Sarabun New" w:cs="TH Sarabun New"/>
-          <w:b w:val="0"/>
-          <w:i w:val="0"/>
-          <w:sz w:val="32"/>
-        </w:rPr>
-        <w:t>เพิ่มปุ่มกดบนบัตรข้อความ LINE เพื่อให้เกษตรกรหรือนักวิชาการช่วยกดรายงานผล โดยภาพที่ได้รับการรายงานว่าคลาดเคลื่อนหรือภาพที่ AI มีความมั่นใจต่ำ จะถูกส่งเข้าสู่คิวข้อมูลอัตโนมัติเพื่อให้ผู้เชี่ยวชาญตรวจสอบและนำไปฝึกฝนโมเดลซ้ำ (Fine-tuning) เป็นระยะ ช่วยให้โมเดลมีความแม่นยำสูงขึ้นอย่างต่อเนื่อง</w:t>
+        <w:t xml:space="preserve">การพัฒนาระบบเรียนรู้เพิ่มเติมจากผู้ใช้: </w:t>
+      </w:r>
+      <w:r>
+        <w:rPr>
+          <w:rFonts w:ascii="TH Sarabun New" w:hAnsi="TH Sarabun New" w:cs="TH Sarabun New"/>
+          <w:b w:val="0"/>
+          <w:i w:val="0"/>
+          <w:sz w:val="32"/>
+        </w:rPr>
+        <w:t>เพิ่มปุ่มบนการ์ดข้อความเพื่อให้เกษตรกรหรือเจ้าหน้าที่ช่วยแจ้งผลกรณีระบบตรวจจับผิดพลาด โดยภาพที่มีปัญหาจะถูกส่งเข้าระบบเพื่อให้ผู้เชี่ยวชาญตรวจสอบและนำมาเทรนโมเดลเพิ่มเติมเป็นระยะ ช่วยให้ระบบมีความแม่นยำสูงขึ้นเรื่อย ๆ</w:t>
       </w:r>
     </w:p>
     <w:sectPr>

</xml_diff>

<commit_message>
fix(thesis): clarify that bot responds with diagnosis text and treatment advice, not annotated image
</commit_message>
<xml_diff>
--- a/Project/Chapter_05.docx
+++ b/Project/Chapter_05.docx
@@ -280,7 +280,7 @@
           <w:i w:val="0"/>
           <w:sz w:val="32"/>
         </w:rPr>
-        <w:t>สามารถดูผลการตรวจวินิจฉัยบนภาพ โดยระบบจะแสดงกรอบสี่เหลี่ยม (Bounding Box) ล้อมรอบรอยโรค พร้อมชื่อโรคภาษาอังกฤษและค่าความมั่นใจ (Confidence Score เช่น bacterial_leaf_blight 0.86)</w:t>
+        <w:t>สามารถรับข้อความแจ้งผลการตรวจวินิจฉัยโรคข้าว ซึ่งระบุชื่อโรคที่ตรวจพบและระดับความมั่นใจของระบบ (เช่น พบรอยโรค โรคขอบใบแห้ง ความมั่นใจ 85.4%) หรือแจ้งเตือนหากเป็นใบข้าวสมบูรณ์ดี</w:t>
       </w:r>
     </w:p>
     <w:p>
@@ -305,7 +305,7 @@
           <w:i w:val="0"/>
           <w:sz w:val="32"/>
         </w:rPr>
-        <w:t>สามารถรับคำแนะนำการรักษาผ่านการ์ดข้อความ (LINE Flex Message) ซึ่งสรุปข้อมูลสำคัญครบถ้วน ได้แก่:</w:t>
+        <w:t>สามารถรับข้อความสรุปคำแนะนำการรักษาและการดูแลจัดการแปลงนา ซึ่งประกอบด้วย:</w:t>
       </w:r>
     </w:p>
     <w:p>

</xml_diff>

<commit_message>
fix(thesis): align notification wording with actual code behavior and update future learning mechanism
</commit_message>
<xml_diff>
--- a/Project/Chapter_05.docx
+++ b/Project/Chapter_05.docx
@@ -480,7 +480,7 @@
           <w:i w:val="0"/>
           <w:sz w:val="32"/>
         </w:rPr>
-        <w:t>มีระบบแจ้งเตือนให้ถ่ายภาพใหม่ ในกรณีที่ภาพถ่ายหลุดโฟกัส ภาพเบลอ หรือมืดเกินไป เพื่อช่วยให้ผลการตรวจมีความแม่นยำ</w:t>
+        <w:t>มีข้อความแจ้งเตือนให้ถ่ายภาพใหม่ ในกรณีที่ภาพถ่ายไม่ชัดเจน หลุดโฟกัส หรือระบบมีความมั่นใจในการตรวจจับต่ำ เพื่อช่วยให้ผลการวินิจฉัยมีความถูกต้องแม่นยำ</w:t>
       </w:r>
     </w:p>
     <w:p>
@@ -1232,7 +1232,7 @@
           <w:i w:val="0"/>
           <w:sz w:val="32"/>
         </w:rPr>
-        <w:t>เพิ่มปุ่มบนการ์ดข้อความเพื่อให้เกษตรกรหรือเจ้าหน้าที่ช่วยแจ้งผลกรณีระบบตรวจจับผิดพลาด โดยภาพที่มีปัญหาจะถูกส่งเข้าระบบเพื่อให้ผู้เชี่ยวชาญตรวจสอบและนำมาเทรนโมเดลเพิ่มเติมเป็นระยะ ช่วยให้ระบบมีความแม่นยำสูงขึ้นเรื่อย ๆ</w:t>
+        <w:t>พัฒนาให้มีปุ่มกดหรือเมนูเพื่อให้เกษตรกรหรือเจ้าหน้าที่ช่วยแจ้งผลกรณีระบบตรวจจับผิดพลาด โดยภาพที่มีปัญหาจะถูกส่งเข้าระบบเพื่อให้ผู้เชี่ยวชาญตรวจสอบและนำมาเทรนโมเดลเพิ่มเติมเป็นระยะ ช่วยให้ระบบมีความแม่นยำสูงขึ้นเรื่อย ๆ</w:t>
       </w:r>
     </w:p>
     <w:sectPr>

</xml_diff>